<commit_message>
Add years and courses from every screen, users export, credentials card, trial build with listed users
Co-Authored-By: Claude Opus 5.5 <noreply@anthropic.com>
Claude-Session: https://claude.ai/code/session_01E95FBVHSRnmADzMfHd9bm6
</commit_message>
<xml_diff>
--- a/nursing-management/docs/הנחיות_עבודה.docx
+++ b/nursing-management/docs/הנחיות_עבודה.docx
@@ -38,6 +38,741 @@
         <w:t xml:space="preserve">הנחיות עבודה — התקנה, ניסיון ראשון, משתמשים וסיסמאות</w:t>
       </w:r>
     </w:p>
+    <w:p>
+      <w:pPr>
+        <w:pStyle w:val="Heading1"/>
+        <w:bidi/>
+        <w:spacing w:after="140" w:before="320"/>
+        <w:jc w:val="right"/>
+      </w:pPr>
+      <w:r>
+        <w:rPr>
+          <w:rFonts w:ascii="Arial" w:cs="Arial" w:eastAsia="Arial" w:hAnsi="Arial"/>
+          <w:b/>
+          <w:bCs/>
+          <w:color w:val="1F4E79"/>
+          <w:sz w:val="32"/>
+          <w:szCs w:val="32"/>
+          <w:rtl/>
+        </w:rPr>
+        <w:t xml:space="preserve">0. ניסיון מהיר — קובץ ניסיון עם משתמשים מוכנים</w:t>
+      </w:r>
+    </w:p>
+    <w:p>
+      <w:pPr>
+        <w:bidi/>
+        <w:spacing w:after="100"/>
+        <w:jc w:val="right"/>
+      </w:pPr>
+      <w:r>
+        <w:rPr>
+          <w:rFonts w:ascii="Arial" w:cs="Arial" w:eastAsia="Arial" w:hAnsi="Arial"/>
+          <w:sz w:val="22"/>
+          <w:szCs w:val="22"/>
+          <w:rtl/>
+        </w:rPr>
+        <w:t xml:space="preserve">לניסיון ולהדגמה פותחים את </w:t>
+      </w:r>
+      <w:r>
+        <w:rPr>
+          <w:rFonts w:ascii="Arial" w:cs="Arial" w:eastAsia="Arial" w:hAnsi="Arial"/>
+          <w:b/>
+          <w:bCs/>
+          <w:sz w:val="22"/>
+          <w:szCs w:val="22"/>
+          <w:rtl/>
+        </w:rPr>
+        <w:t xml:space="preserve">מערכת_ניהול_סיעוד_ניסיון.html</w:t>
+      </w:r>
+      <w:r>
+        <w:rPr>
+          <w:rFonts w:ascii="Arial" w:cs="Arial" w:eastAsia="Arial" w:hAnsi="Arial"/>
+          <w:sz w:val="22"/>
+          <w:szCs w:val="22"/>
+          <w:rtl/>
+        </w:rPr>
+        <w:t xml:space="preserve">. הוא כולל נתוני דוגמה (שמות בדויים) ומשתמשים מוכנים, ונשמר בנפרד מהמערכת האמיתית. במסך הכניסה מופיעה רשימת המשתמשים — לחיצה על שורה ממלאת שם משתמש וסיסמה.</w:t>
+      </w:r>
+    </w:p>
+    <w:tbl>
+      <w:tblPr>
+        <w:bidiVisual/>
+        <w:tblW w:type="dxa" w:w="9000"/>
+        <w:tblBorders>
+          <w:top w:val="single" w:color="auto" w:sz="4"/>
+          <w:left w:val="single" w:color="auto" w:sz="4"/>
+          <w:bottom w:val="single" w:color="auto" w:sz="4"/>
+          <w:right w:val="single" w:color="auto" w:sz="4"/>
+          <w:insideH w:val="single" w:color="auto" w:sz="4"/>
+          <w:insideV w:val="single" w:color="auto" w:sz="4"/>
+        </w:tblBorders>
+      </w:tblPr>
+      <w:tblGrid>
+        <w:gridCol w:w="2000"/>
+        <w:gridCol w:w="2400"/>
+        <w:gridCol w:w="4600"/>
+      </w:tblGrid>
+      <w:tr>
+        <w:trPr>
+          <w:tblHeader/>
+        </w:trPr>
+        <w:tc>
+          <w:tcPr>
+            <w:tcW w:type="dxa" w:w="2000"/>
+            <w:shd w:fill="1F4E79" w:color="auto" w:val="clear"/>
+            <w:tcMar>
+              <w:top w:type="dxa" w:w="60"/>
+              <w:left w:type="dxa" w:w="100"/>
+              <w:bottom w:type="dxa" w:w="60"/>
+              <w:right w:type="dxa" w:w="100"/>
+            </w:tcMar>
+          </w:tcPr>
+          <w:p>
+            <w:pPr>
+              <w:bidi/>
+              <w:spacing w:after="0"/>
+              <w:jc w:val="right"/>
+            </w:pPr>
+            <w:r>
+              <w:rPr>
+                <w:rFonts w:ascii="Arial" w:cs="Arial" w:eastAsia="Arial" w:hAnsi="Arial"/>
+                <w:b/>
+                <w:bCs/>
+                <w:color w:val="FFFFFF"/>
+                <w:sz w:val="22"/>
+                <w:szCs w:val="22"/>
+                <w:rtl/>
+              </w:rPr>
+              <w:t xml:space="preserve">שם משתמש</w:t>
+            </w:r>
+          </w:p>
+        </w:tc>
+        <w:tc>
+          <w:tcPr>
+            <w:tcW w:type="dxa" w:w="2400"/>
+            <w:shd w:fill="1F4E79" w:color="auto" w:val="clear"/>
+            <w:tcMar>
+              <w:top w:type="dxa" w:w="60"/>
+              <w:left w:type="dxa" w:w="100"/>
+              <w:bottom w:type="dxa" w:w="60"/>
+              <w:right w:type="dxa" w:w="100"/>
+            </w:tcMar>
+          </w:tcPr>
+          <w:p>
+            <w:pPr>
+              <w:bidi/>
+              <w:spacing w:after="0"/>
+              <w:jc w:val="right"/>
+            </w:pPr>
+            <w:r>
+              <w:rPr>
+                <w:rFonts w:ascii="Arial" w:cs="Arial" w:eastAsia="Arial" w:hAnsi="Arial"/>
+                <w:b/>
+                <w:bCs/>
+                <w:color w:val="FFFFFF"/>
+                <w:sz w:val="22"/>
+                <w:szCs w:val="22"/>
+                <w:rtl/>
+              </w:rPr>
+              <w:t xml:space="preserve">סיסמה</w:t>
+            </w:r>
+          </w:p>
+        </w:tc>
+        <w:tc>
+          <w:tcPr>
+            <w:tcW w:type="dxa" w:w="4600"/>
+            <w:shd w:fill="1F4E79" w:color="auto" w:val="clear"/>
+            <w:tcMar>
+              <w:top w:type="dxa" w:w="60"/>
+              <w:left w:type="dxa" w:w="100"/>
+              <w:bottom w:type="dxa" w:w="60"/>
+              <w:right w:type="dxa" w:w="100"/>
+            </w:tcMar>
+          </w:tcPr>
+          <w:p>
+            <w:pPr>
+              <w:bidi/>
+              <w:spacing w:after="0"/>
+              <w:jc w:val="right"/>
+            </w:pPr>
+            <w:r>
+              <w:rPr>
+                <w:rFonts w:ascii="Arial" w:cs="Arial" w:eastAsia="Arial" w:hAnsi="Arial"/>
+                <w:b/>
+                <w:bCs/>
+                <w:color w:val="FFFFFF"/>
+                <w:sz w:val="22"/>
+                <w:szCs w:val="22"/>
+                <w:rtl/>
+              </w:rPr>
+              <w:t xml:space="preserve">מה מותר</w:t>
+            </w:r>
+          </w:p>
+        </w:tc>
+      </w:tr>
+      <w:tr>
+        <w:trPr>
+          <w:tblHeader w:val="false"/>
+        </w:trPr>
+        <w:tc>
+          <w:tcPr>
+            <w:tcW w:type="dxa" w:w="2000"/>
+            <w:tcMar>
+              <w:top w:type="dxa" w:w="60"/>
+              <w:left w:type="dxa" w:w="100"/>
+              <w:bottom w:type="dxa" w:w="60"/>
+              <w:right w:type="dxa" w:w="100"/>
+            </w:tcMar>
+          </w:tcPr>
+          <w:p>
+            <w:pPr>
+              <w:bidi/>
+              <w:spacing w:after="0"/>
+              <w:jc w:val="right"/>
+            </w:pPr>
+            <w:r>
+              <w:rPr>
+                <w:rFonts w:ascii="Arial" w:cs="Arial" w:eastAsia="Arial" w:hAnsi="Arial"/>
+                <w:sz w:val="22"/>
+                <w:szCs w:val="22"/>
+                <w:rtl/>
+              </w:rPr>
+              <w:t xml:space="preserve">admin</w:t>
+            </w:r>
+          </w:p>
+        </w:tc>
+        <w:tc>
+          <w:tcPr>
+            <w:tcW w:type="dxa" w:w="2400"/>
+            <w:tcMar>
+              <w:top w:type="dxa" w:w="60"/>
+              <w:left w:type="dxa" w:w="100"/>
+              <w:bottom w:type="dxa" w:w="60"/>
+              <w:right w:type="dxa" w:w="100"/>
+            </w:tcMar>
+          </w:tcPr>
+          <w:p>
+            <w:pPr>
+              <w:bidi/>
+              <w:spacing w:after="0"/>
+              <w:jc w:val="right"/>
+            </w:pPr>
+            <w:r>
+              <w:rPr>
+                <w:rFonts w:ascii="Arial" w:cs="Arial" w:eastAsia="Arial" w:hAnsi="Arial"/>
+                <w:sz w:val="22"/>
+                <w:szCs w:val="22"/>
+                <w:rtl/>
+              </w:rPr>
+              <w:t xml:space="preserve">Nihul2026!</w:t>
+            </w:r>
+          </w:p>
+        </w:tc>
+        <w:tc>
+          <w:tcPr>
+            <w:tcW w:type="dxa" w:w="4600"/>
+            <w:tcMar>
+              <w:top w:type="dxa" w:w="60"/>
+              <w:left w:type="dxa" w:w="100"/>
+              <w:bottom w:type="dxa" w:w="60"/>
+              <w:right w:type="dxa" w:w="100"/>
+            </w:tcMar>
+          </w:tcPr>
+          <w:p>
+            <w:pPr>
+              <w:bidi/>
+              <w:spacing w:after="0"/>
+              <w:jc w:val="right"/>
+            </w:pPr>
+            <w:r>
+              <w:rPr>
+                <w:rFonts w:ascii="Arial" w:cs="Arial" w:eastAsia="Arial" w:hAnsi="Arial"/>
+                <w:sz w:val="22"/>
+                <w:szCs w:val="22"/>
+                <w:rtl/>
+              </w:rPr>
+              <w:t xml:space="preserve">מנהל/ת מערכת — הכל</w:t>
+            </w:r>
+          </w:p>
+        </w:tc>
+      </w:tr>
+      <w:tr>
+        <w:trPr>
+          <w:tblHeader w:val="false"/>
+        </w:trPr>
+        <w:tc>
+          <w:tcPr>
+            <w:tcW w:type="dxa" w:w="2000"/>
+            <w:tcMar>
+              <w:top w:type="dxa" w:w="60"/>
+              <w:left w:type="dxa" w:w="100"/>
+              <w:bottom w:type="dxa" w:w="60"/>
+              <w:right w:type="dxa" w:w="100"/>
+            </w:tcMar>
+          </w:tcPr>
+          <w:p>
+            <w:pPr>
+              <w:bidi/>
+              <w:spacing w:after="0"/>
+              <w:jc w:val="right"/>
+            </w:pPr>
+            <w:r>
+              <w:rPr>
+                <w:rFonts w:ascii="Arial" w:cs="Arial" w:eastAsia="Arial" w:hAnsi="Arial"/>
+                <w:sz w:val="22"/>
+                <w:szCs w:val="22"/>
+                <w:rtl/>
+              </w:rPr>
+              <w:t xml:space="preserve">admin2</w:t>
+            </w:r>
+          </w:p>
+        </w:tc>
+        <w:tc>
+          <w:tcPr>
+            <w:tcW w:type="dxa" w:w="2400"/>
+            <w:tcMar>
+              <w:top w:type="dxa" w:w="60"/>
+              <w:left w:type="dxa" w:w="100"/>
+              <w:bottom w:type="dxa" w:w="60"/>
+              <w:right w:type="dxa" w:w="100"/>
+            </w:tcMar>
+          </w:tcPr>
+          <w:p>
+            <w:pPr>
+              <w:bidi/>
+              <w:spacing w:after="0"/>
+              <w:jc w:val="right"/>
+            </w:pPr>
+            <w:r>
+              <w:rPr>
+                <w:rFonts w:ascii="Arial" w:cs="Arial" w:eastAsia="Arial" w:hAnsi="Arial"/>
+                <w:sz w:val="22"/>
+                <w:szCs w:val="22"/>
+                <w:rtl/>
+              </w:rPr>
+              <w:t xml:space="preserve">Siud2026!</w:t>
+            </w:r>
+          </w:p>
+        </w:tc>
+        <w:tc>
+          <w:tcPr>
+            <w:tcW w:type="dxa" w:w="4600"/>
+            <w:tcMar>
+              <w:top w:type="dxa" w:w="60"/>
+              <w:left w:type="dxa" w:w="100"/>
+              <w:bottom w:type="dxa" w:w="60"/>
+              <w:right w:type="dxa" w:w="100"/>
+            </w:tcMar>
+          </w:tcPr>
+          <w:p>
+            <w:pPr>
+              <w:bidi/>
+              <w:spacing w:after="0"/>
+              <w:jc w:val="right"/>
+            </w:pPr>
+            <w:r>
+              <w:rPr>
+                <w:rFonts w:ascii="Arial" w:cs="Arial" w:eastAsia="Arial" w:hAnsi="Arial"/>
+                <w:sz w:val="22"/>
+                <w:szCs w:val="22"/>
+                <w:rtl/>
+              </w:rPr>
+              <w:t xml:space="preserve">מנהל/ת מערכת נוסף/ת</w:t>
+            </w:r>
+          </w:p>
+        </w:tc>
+      </w:tr>
+      <w:tr>
+        <w:trPr>
+          <w:tblHeader w:val="false"/>
+        </w:trPr>
+        <w:tc>
+          <w:tcPr>
+            <w:tcW w:type="dxa" w:w="2000"/>
+            <w:tcMar>
+              <w:top w:type="dxa" w:w="60"/>
+              <w:left w:type="dxa" w:w="100"/>
+              <w:bottom w:type="dxa" w:w="60"/>
+              <w:right w:type="dxa" w:w="100"/>
+            </w:tcMar>
+          </w:tcPr>
+          <w:p>
+            <w:pPr>
+              <w:bidi/>
+              <w:spacing w:after="0"/>
+              <w:jc w:val="right"/>
+            </w:pPr>
+            <w:r>
+              <w:rPr>
+                <w:rFonts w:ascii="Arial" w:cs="Arial" w:eastAsia="Arial" w:hAnsi="Arial"/>
+                <w:sz w:val="22"/>
+                <w:szCs w:val="22"/>
+                <w:rtl/>
+              </w:rPr>
+              <w:t xml:space="preserve">editor</w:t>
+            </w:r>
+          </w:p>
+        </w:tc>
+        <w:tc>
+          <w:tcPr>
+            <w:tcW w:type="dxa" w:w="2400"/>
+            <w:tcMar>
+              <w:top w:type="dxa" w:w="60"/>
+              <w:left w:type="dxa" w:w="100"/>
+              <w:bottom w:type="dxa" w:w="60"/>
+              <w:right w:type="dxa" w:w="100"/>
+            </w:tcMar>
+          </w:tcPr>
+          <w:p>
+            <w:pPr>
+              <w:bidi/>
+              <w:spacing w:after="0"/>
+              <w:jc w:val="right"/>
+            </w:pPr>
+            <w:r>
+              <w:rPr>
+                <w:rFonts w:ascii="Arial" w:cs="Arial" w:eastAsia="Arial" w:hAnsi="Arial"/>
+                <w:sz w:val="22"/>
+                <w:szCs w:val="22"/>
+                <w:rtl/>
+              </w:rPr>
+              <w:t xml:space="preserve">Orech2026!</w:t>
+            </w:r>
+          </w:p>
+        </w:tc>
+        <w:tc>
+          <w:tcPr>
+            <w:tcW w:type="dxa" w:w="4600"/>
+            <w:tcMar>
+              <w:top w:type="dxa" w:w="60"/>
+              <w:left w:type="dxa" w:w="100"/>
+              <w:bottom w:type="dxa" w:w="60"/>
+              <w:right w:type="dxa" w:w="100"/>
+            </w:tcMar>
+          </w:tcPr>
+          <w:p>
+            <w:pPr>
+              <w:bidi/>
+              <w:spacing w:after="0"/>
+              <w:jc w:val="right"/>
+            </w:pPr>
+            <w:r>
+              <w:rPr>
+                <w:rFonts w:ascii="Arial" w:cs="Arial" w:eastAsia="Arial" w:hAnsi="Arial"/>
+                <w:sz w:val="22"/>
+                <w:szCs w:val="22"/>
+                <w:rtl/>
+              </w:rPr>
+              <w:t xml:space="preserve">עריכה שוטפת</w:t>
+            </w:r>
+          </w:p>
+        </w:tc>
+      </w:tr>
+      <w:tr>
+        <w:trPr>
+          <w:tblHeader w:val="false"/>
+        </w:trPr>
+        <w:tc>
+          <w:tcPr>
+            <w:tcW w:type="dxa" w:w="2000"/>
+            <w:tcMar>
+              <w:top w:type="dxa" w:w="60"/>
+              <w:left w:type="dxa" w:w="100"/>
+              <w:bottom w:type="dxa" w:w="60"/>
+              <w:right w:type="dxa" w:w="100"/>
+            </w:tcMar>
+          </w:tcPr>
+          <w:p>
+            <w:pPr>
+              <w:bidi/>
+              <w:spacing w:after="0"/>
+              <w:jc w:val="right"/>
+            </w:pPr>
+            <w:r>
+              <w:rPr>
+                <w:rFonts w:ascii="Arial" w:cs="Arial" w:eastAsia="Arial" w:hAnsi="Arial"/>
+                <w:sz w:val="22"/>
+                <w:szCs w:val="22"/>
+                <w:rtl/>
+              </w:rPr>
+              <w:t xml:space="preserve">viewer</w:t>
+            </w:r>
+          </w:p>
+        </w:tc>
+        <w:tc>
+          <w:tcPr>
+            <w:tcW w:type="dxa" w:w="2400"/>
+            <w:tcMar>
+              <w:top w:type="dxa" w:w="60"/>
+              <w:left w:type="dxa" w:w="100"/>
+              <w:bottom w:type="dxa" w:w="60"/>
+              <w:right w:type="dxa" w:w="100"/>
+            </w:tcMar>
+          </w:tcPr>
+          <w:p>
+            <w:pPr>
+              <w:bidi/>
+              <w:spacing w:after="0"/>
+              <w:jc w:val="right"/>
+            </w:pPr>
+            <w:r>
+              <w:rPr>
+                <w:rFonts w:ascii="Arial" w:cs="Arial" w:eastAsia="Arial" w:hAnsi="Arial"/>
+                <w:sz w:val="22"/>
+                <w:szCs w:val="22"/>
+                <w:rtl/>
+              </w:rPr>
+              <w:t xml:space="preserve">Tzofe2026!</w:t>
+            </w:r>
+          </w:p>
+        </w:tc>
+        <w:tc>
+          <w:tcPr>
+            <w:tcW w:type="dxa" w:w="4600"/>
+            <w:tcMar>
+              <w:top w:type="dxa" w:w="60"/>
+              <w:left w:type="dxa" w:w="100"/>
+              <w:bottom w:type="dxa" w:w="60"/>
+              <w:right w:type="dxa" w:w="100"/>
+            </w:tcMar>
+          </w:tcPr>
+          <w:p>
+            <w:pPr>
+              <w:bidi/>
+              <w:spacing w:after="0"/>
+              <w:jc w:val="right"/>
+            </w:pPr>
+            <w:r>
+              <w:rPr>
+                <w:rFonts w:ascii="Arial" w:cs="Arial" w:eastAsia="Arial" w:hAnsi="Arial"/>
+                <w:sz w:val="22"/>
+                <w:szCs w:val="22"/>
+                <w:rtl/>
+              </w:rPr>
+              <w:t xml:space="preserve">צפייה בלבד</w:t>
+            </w:r>
+          </w:p>
+        </w:tc>
+      </w:tr>
+      <w:tr>
+        <w:trPr>
+          <w:tblHeader w:val="false"/>
+        </w:trPr>
+        <w:tc>
+          <w:tcPr>
+            <w:tcW w:type="dxa" w:w="2000"/>
+            <w:tcMar>
+              <w:top w:type="dxa" w:w="60"/>
+              <w:left w:type="dxa" w:w="100"/>
+              <w:bottom w:type="dxa" w:w="60"/>
+              <w:right w:type="dxa" w:w="100"/>
+            </w:tcMar>
+          </w:tcPr>
+          <w:p>
+            <w:pPr>
+              <w:bidi/>
+              <w:spacing w:after="0"/>
+              <w:jc w:val="right"/>
+            </w:pPr>
+            <w:r>
+              <w:rPr>
+                <w:rFonts w:ascii="Arial" w:cs="Arial" w:eastAsia="Arial" w:hAnsi="Arial"/>
+                <w:sz w:val="22"/>
+                <w:szCs w:val="22"/>
+                <w:rtl/>
+              </w:rPr>
+              <w:t xml:space="preserve">ward5</w:t>
+            </w:r>
+          </w:p>
+        </w:tc>
+        <w:tc>
+          <w:tcPr>
+            <w:tcW w:type="dxa" w:w="2400"/>
+            <w:tcMar>
+              <w:top w:type="dxa" w:w="60"/>
+              <w:left w:type="dxa" w:w="100"/>
+              <w:bottom w:type="dxa" w:w="60"/>
+              <w:right w:type="dxa" w:w="100"/>
+            </w:tcMar>
+          </w:tcPr>
+          <w:p>
+            <w:pPr>
+              <w:bidi/>
+              <w:spacing w:after="0"/>
+              <w:jc w:val="right"/>
+            </w:pPr>
+            <w:r>
+              <w:rPr>
+                <w:rFonts w:ascii="Arial" w:cs="Arial" w:eastAsia="Arial" w:hAnsi="Arial"/>
+                <w:sz w:val="22"/>
+                <w:szCs w:val="22"/>
+                <w:rtl/>
+              </w:rPr>
+              <w:t xml:space="preserve">Machlaka2026!</w:t>
+            </w:r>
+          </w:p>
+        </w:tc>
+        <w:tc>
+          <w:tcPr>
+            <w:tcW w:type="dxa" w:w="4600"/>
+            <w:tcMar>
+              <w:top w:type="dxa" w:w="60"/>
+              <w:left w:type="dxa" w:w="100"/>
+              <w:bottom w:type="dxa" w:w="60"/>
+              <w:right w:type="dxa" w:w="100"/>
+            </w:tcMar>
+          </w:tcPr>
+          <w:p>
+            <w:pPr>
+              <w:bidi/>
+              <w:spacing w:after="0"/>
+              <w:jc w:val="right"/>
+            </w:pPr>
+            <w:r>
+              <w:rPr>
+                <w:rFonts w:ascii="Arial" w:cs="Arial" w:eastAsia="Arial" w:hAnsi="Arial"/>
+                <w:sz w:val="22"/>
+                <w:szCs w:val="22"/>
+                <w:rtl/>
+              </w:rPr>
+              <w:t xml:space="preserve">עריכה — רק מחלקת שיקום ה'</w:t>
+            </w:r>
+          </w:p>
+        </w:tc>
+      </w:tr>
+    </w:tbl>
+    <w:p>
+      <w:pPr>
+        <w:bidi/>
+        <w:spacing w:after="100"/>
+        <w:jc w:val="right"/>
+      </w:pPr>
+      <w:r>
+        <w:rPr>
+          <w:rFonts w:ascii="Arial" w:cs="Arial" w:eastAsia="Arial" w:hAnsi="Arial"/>
+          <w:sz w:val="22"/>
+          <w:szCs w:val="22"/>
+          <w:rtl/>
+        </w:rPr>
+        <w:t xml:space="preserve"/>
+      </w:r>
+    </w:p>
+    <w:p>
+      <w:pPr>
+        <w:bidi/>
+        <w:spacing w:after="100"/>
+        <w:jc w:val="right"/>
+      </w:pPr>
+      <w:r>
+        <w:rPr>
+          <w:rFonts w:ascii="Arial" w:cs="Arial" w:eastAsia="Arial" w:hAnsi="Arial"/>
+          <w:sz w:val="22"/>
+          <w:szCs w:val="22"/>
+          <w:rtl/>
+        </w:rPr>
+        <w:t xml:space="preserve">בכל פתיחה של קובץ הניסיון הסיסמאות האלה חוזרות והנעילות מתאפסות. הרשימה נמצאת גם בקובץ משתמשים_וסיסמאות_ניסיון.xlsx.</w:t>
+      </w:r>
+    </w:p>
+    <w:p>
+      <w:pPr>
+        <w:bidi/>
+        <w:spacing w:after="100"/>
+        <w:jc w:val="right"/>
+      </w:pPr>
+      <w:r>
+        <w:rPr>
+          <w:rFonts w:ascii="Arial" w:cs="Arial" w:eastAsia="Arial" w:hAnsi="Arial"/>
+          <w:sz w:val="22"/>
+          <w:szCs w:val="22"/>
+          <w:rtl/>
+        </w:rPr>
+        <w:t xml:space="preserve"/>
+      </w:r>
+      <w:r>
+        <w:rPr>
+          <w:rFonts w:ascii="Arial" w:cs="Arial" w:eastAsia="Arial" w:hAnsi="Arial"/>
+          <w:b/>
+          <w:bCs/>
+          <w:sz w:val="22"/>
+          <w:szCs w:val="22"/>
+          <w:rtl/>
+        </w:rPr>
+        <w:t xml:space="preserve">מערכת_ניהול_סיעוד_הדגמה.html</w:t>
+      </w:r>
+      <w:r>
+        <w:rPr>
+          <w:rFonts w:ascii="Arial" w:cs="Arial" w:eastAsia="Arial" w:hAnsi="Arial"/>
+          <w:sz w:val="22"/>
+          <w:szCs w:val="22"/>
+          <w:rtl/>
+        </w:rPr>
+        <w:t xml:space="preserve"> — נפתח ישר למערכת בלי מסך כניסה, להדגמה מהירה.</w:t>
+      </w:r>
+    </w:p>
+    <w:tbl>
+      <w:tblPr>
+        <w:bidiVisual/>
+        <w:tblW w:type="dxa" w:w="9000"/>
+        <w:tblBorders>
+          <w:top w:val="single" w:color="auto" w:sz="4"/>
+          <w:left w:val="single" w:color="auto" w:sz="4"/>
+          <w:bottom w:val="single" w:color="auto" w:sz="4"/>
+          <w:right w:val="single" w:color="auto" w:sz="4"/>
+          <w:insideH w:val="single" w:color="auto" w:sz="4"/>
+          <w:insideV w:val="single" w:color="auto" w:sz="4"/>
+        </w:tblBorders>
+      </w:tblPr>
+      <w:tblGrid>
+        <w:gridCol w:w="9000"/>
+      </w:tblGrid>
+      <w:tr>
+        <w:tc>
+          <w:tcPr>
+            <w:tcW w:type="dxa" w:w="9000"/>
+            <w:tcBorders>
+              <w:top w:val="single" w:color="E0A84B" w:sz="6"/>
+              <w:left w:val="single" w:color="E0A84B" w:sz="6"/>
+              <w:bottom w:val="single" w:color="E0A84B" w:sz="6"/>
+              <w:right w:val="single" w:color="E0A84B" w:sz="6"/>
+            </w:tcBorders>
+            <w:shd w:fill="FDF3E2" w:color="auto" w:val="clear"/>
+            <w:tcMar>
+              <w:top w:type="dxa" w:w="100"/>
+              <w:left w:type="dxa" w:w="160"/>
+              <w:bottom w:type="dxa" w:w="100"/>
+              <w:right w:type="dxa" w:w="160"/>
+            </w:tcMar>
+          </w:tcPr>
+          <w:p>
+            <w:pPr>
+              <w:bidi/>
+              <w:spacing w:after="100"/>
+              <w:jc w:val="right"/>
+            </w:pPr>
+            <w:r>
+              <w:rPr>
+                <w:rFonts w:ascii="Arial" w:cs="Arial" w:eastAsia="Arial" w:hAnsi="Arial"/>
+                <w:b/>
+                <w:bCs/>
+                <w:sz w:val="22"/>
+                <w:szCs w:val="22"/>
+                <w:rtl/>
+              </w:rPr>
+              <w:t xml:space="preserve">למערכת האמיתית </w:t>
+            </w:r>
+            <w:r>
+              <w:rPr>
+                <w:rFonts w:ascii="Arial" w:cs="Arial" w:eastAsia="Arial" w:hAnsi="Arial"/>
+                <w:sz w:val="22"/>
+                <w:szCs w:val="22"/>
+                <w:rtl/>
+              </w:rPr>
+              <w:t xml:space="preserve">משתמשים רק בקובץ מערכת_ניהול_סיעוד.html — בו אין משתמשים מוכנים, ואת המנהל מקימים בפתיחה הראשונה.</w:t>
+            </w:r>
+          </w:p>
+        </w:tc>
+      </w:tr>
+    </w:tbl>
     <w:p>
       <w:pPr>
         <w:pStyle w:val="Heading1"/>
@@ -3307,6 +4042,70 @@
           <w:rtl/>
         </w:rPr>
         <w:t xml:space="preserve"> — מוסיף עמודת שנה לבטיחות הטיפול / שיחות משוב / הערכות. ה-× ליד שנה מסיר אותה מהגיליון ומהדוח (הנתונים לא נמחקים).</w:t>
+      </w:r>
+    </w:p>
+    <w:p>
+      <w:pPr>
+        <w:pStyle w:val="ListParagraph"/>
+        <w:numPr>
+          <w:ilvl w:val="0"/>
+          <w:numId w:val="2"/>
+        </w:numPr>
+        <w:bidi/>
+        <w:spacing w:after="100"/>
+        <w:jc w:val="right"/>
+      </w:pPr>
+      <w:r>
+        <w:rPr>
+          <w:rFonts w:ascii="Arial" w:cs="Arial" w:eastAsia="Arial" w:hAnsi="Arial"/>
+          <w:b/>
+          <w:bCs/>
+          <w:sz w:val="22"/>
+          <w:szCs w:val="22"/>
+          <w:rtl/>
+        </w:rPr>
+        <w:t xml:space="preserve">הוספה בכל מקום: </w:t>
+      </w:r>
+      <w:r>
+        <w:rPr>
+          <w:rFonts w:ascii="Arial" w:cs="Arial" w:eastAsia="Arial" w:hAnsi="Arial"/>
+          <w:sz w:val="22"/>
+          <w:szCs w:val="22"/>
+          <w:rtl/>
+        </w:rPr>
+        <w:t xml:space="preserve">כפתור "+ הוספת שנה" קיים גם בגיליונות (בטיחות, שיחות, הערכות) ובכרטיס העובד. כפתור "+ הוספת קורס / הרשאה" קיים בגיליון חת"ש, בכרטיס העובד ובהגדרות — הפריט החדש מופיע בגיליון, בכרטיס ובדוח (כעמודה נוספת אחרי עמודות הקובץ).</w:t>
+      </w:r>
+    </w:p>
+    <w:p>
+      <w:pPr>
+        <w:pStyle w:val="ListParagraph"/>
+        <w:numPr>
+          <w:ilvl w:val="0"/>
+          <w:numId w:val="2"/>
+        </w:numPr>
+        <w:bidi/>
+        <w:spacing w:after="100"/>
+        <w:jc w:val="right"/>
+      </w:pPr>
+      <w:r>
+        <w:rPr>
+          <w:rFonts w:ascii="Arial" w:cs="Arial" w:eastAsia="Arial" w:hAnsi="Arial"/>
+          <w:b/>
+          <w:bCs/>
+          <w:sz w:val="22"/>
+          <w:szCs w:val="22"/>
+          <w:rtl/>
+        </w:rPr>
+        <w:t xml:space="preserve">משתמשים: </w:t>
+      </w:r>
+      <w:r>
+        <w:rPr>
+          <w:rFonts w:ascii="Arial" w:cs="Arial" w:eastAsia="Arial" w:hAnsi="Arial"/>
+          <w:sz w:val="22"/>
+          <w:szCs w:val="22"/>
+          <w:rtl/>
+        </w:rPr>
+        <w:t xml:space="preserve">ב"משתמשים והרשאות" — "ייצוא רשימת משתמשים" לאקסל. אחרי הקמת משתמש או איפוס סיסמה מוצג כרטיס עם שם המשתמש והסיסמה, עם העתקה והדפסה. סיסמאות קיימות לא ניתן להציג (הן נשמרות מוצפנות) — רק לאפס.</w:t>
       </w:r>
     </w:p>
     <w:p>

</xml_diff>